<commit_message>
Alterações do exercício do SQL
</commit_message>
<xml_diff>
--- a/Atividade_2/Dicionario.docx
+++ b/Atividade_2/Dicionario.docx
@@ -1,6 +1,6 @@
 
 <file path=word/document.xml><?xml version="1.0" encoding="utf-8"?>
-<w:document xmlns:wpc="http://schemas.microsoft.com/office/word/2010/wordprocessingCanvas" xmlns:cx="http://schemas.microsoft.com/office/drawing/2014/chartex" xmlns:cx1="http://schemas.microsoft.com/office/drawing/2015/9/8/chartex" xmlns:cx2="http://schemas.microsoft.com/office/drawing/2015/10/21/chartex" xmlns:cx3="http://schemas.microsoft.com/office/drawing/2016/5/9/chartex" xmlns:cx4="http://schemas.microsoft.com/office/drawing/2016/5/10/chartex" xmlns:cx5="http://schemas.microsoft.com/office/drawing/2016/5/11/chartex" xmlns:cx6="http://schemas.microsoft.com/office/drawing/2016/5/12/chartex" xmlns:cx7="http://schemas.microsoft.com/office/drawing/2016/5/13/chartex" xmlns:cx8="http://schemas.microsoft.com/office/drawing/2016/5/14/chartex" xmlns:mc="http://schemas.openxmlformats.org/markup-compatibility/2006" xmlns:aink="http://schemas.microsoft.com/office/drawing/2016/ink" xmlns:am3d="http://schemas.microsoft.com/office/drawing/2017/model3d" xmlns:o="urn:schemas-microsoft-com:office:office" xmlns:oel="http://schemas.microsoft.com/office/2019/extlst" xmlns:r="http://schemas.openxmlformats.org/officeDocument/2006/relationships" xmlns:m="http://schemas.openxmlformats.org/officeDocument/2006/math" xmlns:v="urn:schemas-microsoft-com:vml" xmlns:wp14="http://schemas.microsoft.com/office/word/2010/wordprocessingDrawing" xmlns:wp="http://schemas.openxmlformats.org/drawingml/2006/wordprocessingDrawing" xmlns:w10="urn:schemas-microsoft-com:office:word" xmlns:w="http://schemas.openxmlformats.org/wordprocessingml/2006/main" xmlns:w14="http://schemas.microsoft.com/office/word/2010/wordml" xmlns:w15="http://schemas.microsoft.com/office/word/2012/wordml" xmlns:w16cex="http://schemas.microsoft.com/office/word/2018/wordml/cex" xmlns:w16cid="http://schemas.microsoft.com/office/word/2016/wordml/cid" xmlns:w16="http://schemas.microsoft.com/office/word/2018/wordml" xmlns:w16du="http://schemas.microsoft.com/office/word/2023/wordml/word16du" xmlns:w16sdtdh="http://schemas.microsoft.com/office/word/2020/wordml/sdtdatahash" xmlns:w16sdtfl="http://schemas.microsoft.com/office/word/2024/wordml/sdtformatlock" xmlns:w16se="http://schemas.microsoft.com/office/word/2015/wordml/symex" xmlns:wpg="http://schemas.microsoft.com/office/word/2010/wordprocessingGroup" xmlns:wpi="http://schemas.microsoft.com/office/word/2010/wordprocessingInk" xmlns:wne="http://schemas.microsoft.com/office/word/2006/wordml" xmlns:wps="http://schemas.microsoft.com/office/word/2010/wordprocessingShape" mc:Ignorable="w14 w15 w16se w16cid w16 w16cex w16sdtdh w16sdtfl w16du wp14">
+<w:document xmlns:wpc="http://schemas.microsoft.com/office/word/2010/wordprocessingCanvas" xmlns:cx="http://schemas.microsoft.com/office/drawing/2014/chartex" xmlns:cx1="http://schemas.microsoft.com/office/drawing/2015/9/8/chartex" xmlns:cx2="http://schemas.microsoft.com/office/drawing/2015/10/21/chartex" xmlns:cx3="http://schemas.microsoft.com/office/drawing/2016/5/9/chartex" xmlns:cx4="http://schemas.microsoft.com/office/drawing/2016/5/10/chartex" xmlns:cx5="http://schemas.microsoft.com/office/drawing/2016/5/11/chartex" xmlns:cx6="http://schemas.microsoft.com/office/drawing/2016/5/12/chartex" xmlns:cx7="http://schemas.microsoft.com/office/drawing/2016/5/13/chartex" xmlns:cx8="http://schemas.microsoft.com/office/drawing/2016/5/14/chartex" xmlns:mc="http://schemas.openxmlformats.org/markup-compatibility/2006" xmlns:aink="http://schemas.microsoft.com/office/drawing/2016/ink" xmlns:am3d="http://schemas.microsoft.com/office/drawing/2017/model3d" xmlns:o="urn:schemas-microsoft-com:office:office" xmlns:r="http://schemas.openxmlformats.org/officeDocument/2006/relationships" xmlns:m="http://schemas.openxmlformats.org/officeDocument/2006/math" xmlns:v="urn:schemas-microsoft-com:vml" xmlns:wp14="http://schemas.microsoft.com/office/word/2010/wordprocessingDrawing" xmlns:wp="http://schemas.openxmlformats.org/drawingml/2006/wordprocessingDrawing" xmlns:w10="urn:schemas-microsoft-com:office:word" xmlns:w="http://schemas.openxmlformats.org/wordprocessingml/2006/main" xmlns:w14="http://schemas.microsoft.com/office/word/2010/wordml" xmlns:w15="http://schemas.microsoft.com/office/word/2012/wordml" xmlns:w16cid="http://schemas.microsoft.com/office/word/2016/wordml/cid" xmlns:w16se="http://schemas.microsoft.com/office/word/2015/wordml/symex" xmlns:wpg="http://schemas.microsoft.com/office/word/2010/wordprocessingGroup" xmlns:wpi="http://schemas.microsoft.com/office/word/2010/wordprocessingInk" xmlns:wne="http://schemas.microsoft.com/office/word/2006/wordml" xmlns:wps="http://schemas.microsoft.com/office/word/2010/wordprocessingShape" mc:Ignorable="w14 w15 w16se w16cid wp14">
   <w:body>
     <w:p>
       <w:pPr>
@@ -22,15 +22,16 @@
       <w:tblPr>
         <w:tblStyle w:val="Tabelacomgrade"/>
         <w:tblW w:w="8645" w:type="dxa"/>
+        <w:tblInd w:w="2677" w:type="dxa"/>
         <w:tblLook w:val="04A0" w:firstRow="1" w:lastRow="0" w:firstColumn="1" w:lastColumn="0" w:noHBand="0" w:noVBand="1"/>
       </w:tblPr>
       <w:tblGrid>
-        <w:gridCol w:w="1169"/>
-        <w:gridCol w:w="2124"/>
-        <w:gridCol w:w="992"/>
-        <w:gridCol w:w="1214"/>
-        <w:gridCol w:w="1325"/>
-        <w:gridCol w:w="1821"/>
+        <w:gridCol w:w="1185"/>
+        <w:gridCol w:w="2191"/>
+        <w:gridCol w:w="1005"/>
+        <w:gridCol w:w="1158"/>
+        <w:gridCol w:w="1257"/>
+        <w:gridCol w:w="1849"/>
       </w:tblGrid>
       <w:tr>
         <w:tc>
@@ -39,6 +40,7 @@
           </w:tcPr>
           <w:p>
             <w:pPr>
+              <w:jc w:val="center"/>
               <w:rPr>
                 <w:b/>
                 <w:bCs/>
@@ -59,6 +61,7 @@
           </w:tcPr>
           <w:p>
             <w:pPr>
+              <w:jc w:val="center"/>
               <w:rPr>
                 <w:b/>
                 <w:bCs/>
@@ -79,6 +82,7 @@
           </w:tcPr>
           <w:p>
             <w:pPr>
+              <w:jc w:val="center"/>
               <w:rPr>
                 <w:b/>
                 <w:bCs/>
@@ -99,6 +103,7 @@
           </w:tcPr>
           <w:p>
             <w:pPr>
+              <w:jc w:val="center"/>
               <w:rPr>
                 <w:b/>
                 <w:bCs/>
@@ -119,6 +124,7 @@
           </w:tcPr>
           <w:p>
             <w:pPr>
+              <w:jc w:val="center"/>
               <w:rPr>
                 <w:b/>
                 <w:bCs/>
@@ -139,6 +145,7 @@
           </w:tcPr>
           <w:p>
             <w:pPr>
+              <w:jc w:val="center"/>
               <w:rPr>
                 <w:b/>
                 <w:bCs/>
@@ -161,6 +168,7 @@
           </w:tcPr>
           <w:p>
             <w:pPr>
+              <w:jc w:val="center"/>
               <w:rPr>
                 <w:sz w:val="22"/>
                 <w:szCs w:val="22"/>
@@ -181,6 +189,7 @@
           </w:tcPr>
           <w:p>
             <w:pPr>
+              <w:jc w:val="center"/>
               <w:rPr>
                 <w:sz w:val="22"/>
                 <w:szCs w:val="22"/>
@@ -238,6 +247,7 @@
           </w:tcPr>
           <w:p>
             <w:pPr>
+              <w:jc w:val="center"/>
               <w:rPr>
                 <w:sz w:val="22"/>
                 <w:szCs w:val="22"/>
@@ -260,6 +270,7 @@
           </w:tcPr>
           <w:p>
             <w:pPr>
+              <w:jc w:val="center"/>
               <w:rPr>
                 <w:sz w:val="22"/>
                 <w:szCs w:val="22"/>
@@ -280,6 +291,7 @@
           </w:tcPr>
           <w:p>
             <w:pPr>
+              <w:jc w:val="center"/>
               <w:rPr>
                 <w:sz w:val="22"/>
                 <w:szCs w:val="22"/>
@@ -300,6 +312,7 @@
           </w:tcPr>
           <w:p>
             <w:pPr>
+              <w:jc w:val="center"/>
               <w:rPr>
                 <w:sz w:val="22"/>
                 <w:szCs w:val="22"/>
@@ -322,6 +335,7 @@
           </w:tcPr>
           <w:p>
             <w:pPr>
+              <w:jc w:val="center"/>
               <w:rPr>
                 <w:sz w:val="22"/>
                 <w:szCs w:val="22"/>
@@ -342,6 +356,7 @@
           </w:tcPr>
           <w:p>
             <w:pPr>
+              <w:jc w:val="center"/>
               <w:rPr>
                 <w:sz w:val="22"/>
                 <w:szCs w:val="22"/>
@@ -371,6 +386,7 @@
           </w:tcPr>
           <w:p>
             <w:pPr>
+              <w:jc w:val="center"/>
               <w:rPr>
                 <w:sz w:val="22"/>
                 <w:szCs w:val="22"/>
@@ -391,6 +407,7 @@
           </w:tcPr>
           <w:p>
             <w:pPr>
+              <w:jc w:val="center"/>
               <w:rPr>
                 <w:sz w:val="22"/>
                 <w:szCs w:val="22"/>
@@ -411,6 +428,7 @@
           </w:tcPr>
           <w:p>
             <w:pPr>
+              <w:jc w:val="center"/>
               <w:rPr>
                 <w:sz w:val="22"/>
                 <w:szCs w:val="22"/>
@@ -431,11 +449,13 @@
           </w:tcPr>
           <w:p>
             <w:pPr>
-              <w:rPr>
-                <w:sz w:val="22"/>
-                <w:szCs w:val="22"/>
-              </w:rPr>
-            </w:pPr>
+              <w:jc w:val="center"/>
+              <w:rPr>
+                <w:sz w:val="22"/>
+                <w:szCs w:val="22"/>
+              </w:rPr>
+            </w:pPr>
+            <w:proofErr w:type="gramStart"/>
             <w:r>
               <w:rPr>
                 <w:sz w:val="22"/>
@@ -443,6 +463,7 @@
               </w:rPr>
               <w:t>Chave Primaria</w:t>
             </w:r>
+            <w:proofErr w:type="gramEnd"/>
           </w:p>
         </w:tc>
       </w:tr>
@@ -453,6 +474,7 @@
           </w:tcPr>
           <w:p>
             <w:pPr>
+              <w:jc w:val="center"/>
               <w:rPr>
                 <w:sz w:val="22"/>
                 <w:szCs w:val="22"/>
@@ -473,6 +495,7 @@
           </w:tcPr>
           <w:p>
             <w:pPr>
+              <w:jc w:val="center"/>
               <w:rPr>
                 <w:sz w:val="22"/>
                 <w:szCs w:val="22"/>
@@ -516,6 +539,7 @@
           </w:tcPr>
           <w:p>
             <w:pPr>
+              <w:jc w:val="center"/>
               <w:rPr>
                 <w:sz w:val="22"/>
                 <w:szCs w:val="22"/>
@@ -538,6 +562,7 @@
           </w:tcPr>
           <w:p>
             <w:pPr>
+              <w:jc w:val="center"/>
               <w:rPr>
                 <w:sz w:val="22"/>
                 <w:szCs w:val="22"/>
@@ -558,6 +583,7 @@
           </w:tcPr>
           <w:p>
             <w:pPr>
+              <w:jc w:val="center"/>
               <w:rPr>
                 <w:sz w:val="22"/>
                 <w:szCs w:val="22"/>
@@ -578,6 +604,7 @@
           </w:tcPr>
           <w:p>
             <w:pPr>
+              <w:jc w:val="center"/>
               <w:rPr>
                 <w:sz w:val="22"/>
                 <w:szCs w:val="22"/>
@@ -600,6 +627,7 @@
           </w:tcPr>
           <w:p>
             <w:pPr>
+              <w:jc w:val="center"/>
               <w:rPr>
                 <w:sz w:val="22"/>
                 <w:szCs w:val="22"/>
@@ -620,6 +648,7 @@
           </w:tcPr>
           <w:p>
             <w:pPr>
+              <w:jc w:val="center"/>
               <w:rPr>
                 <w:sz w:val="22"/>
                 <w:szCs w:val="22"/>
@@ -649,6 +678,7 @@
           </w:tcPr>
           <w:p>
             <w:pPr>
+              <w:jc w:val="center"/>
               <w:rPr>
                 <w:sz w:val="22"/>
                 <w:szCs w:val="22"/>
@@ -663,13 +693,6 @@
               <w:t>Varchar</w:t>
             </w:r>
             <w:proofErr w:type="spellEnd"/>
-            <w:r>
-              <w:rPr>
-                <w:sz w:val="22"/>
-                <w:szCs w:val="22"/>
-              </w:rPr>
-              <w:t xml:space="preserve"> </w:t>
-            </w:r>
           </w:p>
         </w:tc>
         <w:tc>
@@ -678,6 +701,7 @@
           </w:tcPr>
           <w:p>
             <w:pPr>
+              <w:jc w:val="center"/>
               <w:rPr>
                 <w:sz w:val="22"/>
                 <w:szCs w:val="22"/>
@@ -698,6 +722,7 @@
           </w:tcPr>
           <w:p>
             <w:pPr>
+              <w:jc w:val="center"/>
               <w:rPr>
                 <w:sz w:val="22"/>
                 <w:szCs w:val="22"/>
@@ -718,6 +743,7 @@
           </w:tcPr>
           <w:p>
             <w:pPr>
+              <w:jc w:val="center"/>
               <w:rPr>
                 <w:sz w:val="22"/>
                 <w:szCs w:val="22"/>
@@ -740,6 +766,7 @@
           </w:tcPr>
           <w:p>
             <w:pPr>
+              <w:jc w:val="center"/>
               <w:rPr>
                 <w:sz w:val="22"/>
                 <w:szCs w:val="22"/>
@@ -760,6 +787,7 @@
           </w:tcPr>
           <w:p>
             <w:pPr>
+              <w:jc w:val="center"/>
               <w:rPr>
                 <w:sz w:val="22"/>
                 <w:szCs w:val="22"/>
@@ -803,6 +831,7 @@
           </w:tcPr>
           <w:p>
             <w:pPr>
+              <w:jc w:val="center"/>
               <w:rPr>
                 <w:sz w:val="22"/>
                 <w:szCs w:val="22"/>
@@ -825,6 +854,7 @@
           </w:tcPr>
           <w:p>
             <w:pPr>
+              <w:jc w:val="center"/>
               <w:rPr>
                 <w:sz w:val="22"/>
                 <w:szCs w:val="22"/>
@@ -845,6 +875,7 @@
           </w:tcPr>
           <w:p>
             <w:pPr>
+              <w:jc w:val="center"/>
               <w:rPr>
                 <w:sz w:val="22"/>
                 <w:szCs w:val="22"/>
@@ -865,6 +896,7 @@
           </w:tcPr>
           <w:p>
             <w:pPr>
+              <w:jc w:val="center"/>
               <w:rPr>
                 <w:sz w:val="22"/>
                 <w:szCs w:val="22"/>
@@ -882,6 +914,87 @@
       </w:tr>
     </w:tbl>
     <w:p/>
+    <w:p>
+      <w:pPr>
+        <w:jc w:val="center"/>
+        <w:rPr>
+          <w:b/>
+          <w:bCs/>
+        </w:rPr>
+      </w:pPr>
+    </w:p>
+    <w:p>
+      <w:pPr>
+        <w:jc w:val="center"/>
+        <w:rPr>
+          <w:b/>
+          <w:bCs/>
+        </w:rPr>
+      </w:pPr>
+    </w:p>
+    <w:p>
+      <w:pPr>
+        <w:jc w:val="center"/>
+        <w:rPr>
+          <w:b/>
+          <w:bCs/>
+        </w:rPr>
+      </w:pPr>
+    </w:p>
+    <w:p>
+      <w:pPr>
+        <w:jc w:val="center"/>
+        <w:rPr>
+          <w:b/>
+          <w:bCs/>
+        </w:rPr>
+      </w:pPr>
+    </w:p>
+    <w:p>
+      <w:pPr>
+        <w:jc w:val="center"/>
+        <w:rPr>
+          <w:b/>
+          <w:bCs/>
+        </w:rPr>
+      </w:pPr>
+    </w:p>
+    <w:p>
+      <w:pPr>
+        <w:jc w:val="center"/>
+        <w:rPr>
+          <w:b/>
+          <w:bCs/>
+        </w:rPr>
+      </w:pPr>
+    </w:p>
+    <w:p>
+      <w:pPr>
+        <w:jc w:val="center"/>
+        <w:rPr>
+          <w:b/>
+          <w:bCs/>
+        </w:rPr>
+      </w:pPr>
+    </w:p>
+    <w:p>
+      <w:pPr>
+        <w:jc w:val="center"/>
+        <w:rPr>
+          <w:b/>
+          <w:bCs/>
+        </w:rPr>
+      </w:pPr>
+    </w:p>
+    <w:p>
+      <w:pPr>
+        <w:jc w:val="center"/>
+        <w:rPr>
+          <w:b/>
+          <w:bCs/>
+        </w:rPr>
+      </w:pPr>
+    </w:p>
     <w:p>
       <w:pPr>
         <w:jc w:val="center"/>
@@ -914,17 +1027,20 @@
         <w:tblLook w:val="04A0" w:firstRow="1" w:lastRow="0" w:firstColumn="1" w:lastColumn="0" w:noHBand="0" w:noVBand="1"/>
       </w:tblPr>
       <w:tblGrid>
-        <w:gridCol w:w="1418"/>
-        <w:gridCol w:w="2126"/>
-        <w:gridCol w:w="1276"/>
-        <w:gridCol w:w="851"/>
-        <w:gridCol w:w="1150"/>
-        <w:gridCol w:w="1820"/>
+        <w:gridCol w:w="1367"/>
+        <w:gridCol w:w="2049"/>
+        <w:gridCol w:w="1230"/>
+        <w:gridCol w:w="820"/>
+        <w:gridCol w:w="1108"/>
+        <w:gridCol w:w="1754"/>
       </w:tblGrid>
       <w:tr>
-        <w:tc>
-          <w:tcPr>
-            <w:tcW w:w="1418" w:type="dxa"/>
+        <w:trPr>
+          <w:trHeight w:val="538"/>
+        </w:trPr>
+        <w:tc>
+          <w:tcPr>
+            <w:tcW w:w="1367" w:type="dxa"/>
           </w:tcPr>
           <w:p>
             <w:pPr>
@@ -945,7 +1061,7 @@
         </w:tc>
         <w:tc>
           <w:tcPr>
-            <w:tcW w:w="2126" w:type="dxa"/>
+            <w:tcW w:w="2049" w:type="dxa"/>
           </w:tcPr>
           <w:p>
             <w:pPr>
@@ -966,7 +1082,7 @@
         </w:tc>
         <w:tc>
           <w:tcPr>
-            <w:tcW w:w="1276" w:type="dxa"/>
+            <w:tcW w:w="1230" w:type="dxa"/>
           </w:tcPr>
           <w:p>
             <w:pPr>
@@ -987,7 +1103,7 @@
         </w:tc>
         <w:tc>
           <w:tcPr>
-            <w:tcW w:w="851" w:type="dxa"/>
+            <w:tcW w:w="820" w:type="dxa"/>
           </w:tcPr>
           <w:p>
             <w:pPr>
@@ -1008,7 +1124,7 @@
         </w:tc>
         <w:tc>
           <w:tcPr>
-            <w:tcW w:w="1150" w:type="dxa"/>
+            <w:tcW w:w="1108" w:type="dxa"/>
           </w:tcPr>
           <w:p>
             <w:pPr>
@@ -1029,7 +1145,7 @@
         </w:tc>
         <w:tc>
           <w:tcPr>
-            <w:tcW w:w="1820" w:type="dxa"/>
+            <w:tcW w:w="1754" w:type="dxa"/>
           </w:tcPr>
           <w:p>
             <w:pPr>
@@ -1050,9 +1166,12 @@
         </w:tc>
       </w:tr>
       <w:tr>
-        <w:tc>
-          <w:tcPr>
-            <w:tcW w:w="1418" w:type="dxa"/>
+        <w:trPr>
+          <w:trHeight w:val="483"/>
+        </w:trPr>
+        <w:tc>
+          <w:tcPr>
+            <w:tcW w:w="1367" w:type="dxa"/>
           </w:tcPr>
           <w:p>
             <w:pPr>
@@ -1073,7 +1192,7 @@
         </w:tc>
         <w:tc>
           <w:tcPr>
-            <w:tcW w:w="2126" w:type="dxa"/>
+            <w:tcW w:w="2049" w:type="dxa"/>
           </w:tcPr>
           <w:p>
             <w:pPr>
@@ -1096,7 +1215,7 @@
         </w:tc>
         <w:tc>
           <w:tcPr>
-            <w:tcW w:w="1276" w:type="dxa"/>
+            <w:tcW w:w="1230" w:type="dxa"/>
           </w:tcPr>
           <w:p>
             <w:pPr>
@@ -1126,7 +1245,7 @@
         </w:tc>
         <w:tc>
           <w:tcPr>
-            <w:tcW w:w="851" w:type="dxa"/>
+            <w:tcW w:w="820" w:type="dxa"/>
           </w:tcPr>
           <w:p>
             <w:pPr>
@@ -1147,7 +1266,7 @@
         </w:tc>
         <w:tc>
           <w:tcPr>
-            <w:tcW w:w="1150" w:type="dxa"/>
+            <w:tcW w:w="1108" w:type="dxa"/>
           </w:tcPr>
           <w:p>
             <w:pPr>
@@ -1167,7 +1286,7 @@
         </w:tc>
         <w:tc>
           <w:tcPr>
-            <w:tcW w:w="1820" w:type="dxa"/>
+            <w:tcW w:w="1754" w:type="dxa"/>
           </w:tcPr>
           <w:p>
             <w:pPr>
@@ -1188,9 +1307,12 @@
         </w:tc>
       </w:tr>
       <w:tr>
-        <w:tc>
-          <w:tcPr>
-            <w:tcW w:w="1418" w:type="dxa"/>
+        <w:trPr>
+          <w:trHeight w:val="738"/>
+        </w:trPr>
+        <w:tc>
+          <w:tcPr>
+            <w:tcW w:w="1367" w:type="dxa"/>
           </w:tcPr>
           <w:p>
             <w:pPr>
@@ -1213,7 +1335,7 @@
         </w:tc>
         <w:tc>
           <w:tcPr>
-            <w:tcW w:w="2126" w:type="dxa"/>
+            <w:tcW w:w="2049" w:type="dxa"/>
           </w:tcPr>
           <w:p>
             <w:pPr>
@@ -1264,7 +1386,7 @@
         </w:tc>
         <w:tc>
           <w:tcPr>
-            <w:tcW w:w="1276" w:type="dxa"/>
+            <w:tcW w:w="1230" w:type="dxa"/>
           </w:tcPr>
           <w:p>
             <w:pPr>
@@ -1287,7 +1409,7 @@
         </w:tc>
         <w:tc>
           <w:tcPr>
-            <w:tcW w:w="851" w:type="dxa"/>
+            <w:tcW w:w="820" w:type="dxa"/>
           </w:tcPr>
           <w:p>
             <w:pPr>
@@ -1308,7 +1430,7 @@
         </w:tc>
         <w:tc>
           <w:tcPr>
-            <w:tcW w:w="1150" w:type="dxa"/>
+            <w:tcW w:w="1108" w:type="dxa"/>
           </w:tcPr>
           <w:p>
             <w:pPr>
@@ -1329,16 +1451,17 @@
         </w:tc>
         <w:tc>
           <w:tcPr>
-            <w:tcW w:w="1820" w:type="dxa"/>
-          </w:tcPr>
-          <w:p>
-            <w:pPr>
-              <w:jc w:val="center"/>
-              <w:rPr>
-                <w:sz w:val="22"/>
-                <w:szCs w:val="22"/>
-              </w:rPr>
-            </w:pPr>
+            <w:tcW w:w="1754" w:type="dxa"/>
+          </w:tcPr>
+          <w:p>
+            <w:pPr>
+              <w:jc w:val="center"/>
+              <w:rPr>
+                <w:sz w:val="22"/>
+                <w:szCs w:val="22"/>
+              </w:rPr>
+            </w:pPr>
+            <w:proofErr w:type="gramStart"/>
             <w:r>
               <w:rPr>
                 <w:sz w:val="22"/>
@@ -1346,13 +1469,17 @@
               </w:rPr>
               <w:t>Chave Primaria</w:t>
             </w:r>
+            <w:proofErr w:type="gramEnd"/>
           </w:p>
         </w:tc>
       </w:tr>
       <w:tr>
-        <w:tc>
-          <w:tcPr>
-            <w:tcW w:w="1418" w:type="dxa"/>
+        <w:trPr>
+          <w:trHeight w:val="729"/>
+        </w:trPr>
+        <w:tc>
+          <w:tcPr>
+            <w:tcW w:w="1367" w:type="dxa"/>
           </w:tcPr>
           <w:p>
             <w:pPr>
@@ -1373,7 +1500,7 @@
         </w:tc>
         <w:tc>
           <w:tcPr>
-            <w:tcW w:w="2126" w:type="dxa"/>
+            <w:tcW w:w="2049" w:type="dxa"/>
           </w:tcPr>
           <w:p>
             <w:pPr>
@@ -1431,7 +1558,7 @@
         </w:tc>
         <w:tc>
           <w:tcPr>
-            <w:tcW w:w="1276" w:type="dxa"/>
+            <w:tcW w:w="1230" w:type="dxa"/>
           </w:tcPr>
           <w:p>
             <w:pPr>
@@ -1454,7 +1581,7 @@
         </w:tc>
         <w:tc>
           <w:tcPr>
-            <w:tcW w:w="851" w:type="dxa"/>
+            <w:tcW w:w="820" w:type="dxa"/>
           </w:tcPr>
           <w:p>
             <w:pPr>
@@ -1475,7 +1602,7 @@
         </w:tc>
         <w:tc>
           <w:tcPr>
-            <w:tcW w:w="1150" w:type="dxa"/>
+            <w:tcW w:w="1108" w:type="dxa"/>
           </w:tcPr>
           <w:p>
             <w:pPr>
@@ -1496,7 +1623,7 @@
         </w:tc>
         <w:tc>
           <w:tcPr>
-            <w:tcW w:w="1820" w:type="dxa"/>
+            <w:tcW w:w="1754" w:type="dxa"/>
           </w:tcPr>
           <w:p>
             <w:pPr>
@@ -1524,9 +1651,12 @@
         </w:tc>
       </w:tr>
       <w:tr>
-        <w:tc>
-          <w:tcPr>
-            <w:tcW w:w="1418" w:type="dxa"/>
+        <w:trPr>
+          <w:trHeight w:val="738"/>
+        </w:trPr>
+        <w:tc>
+          <w:tcPr>
+            <w:tcW w:w="1367" w:type="dxa"/>
           </w:tcPr>
           <w:p>
             <w:pPr>
@@ -1547,7 +1677,7 @@
         </w:tc>
         <w:tc>
           <w:tcPr>
-            <w:tcW w:w="2126" w:type="dxa"/>
+            <w:tcW w:w="2049" w:type="dxa"/>
           </w:tcPr>
           <w:p>
             <w:pPr>
@@ -1591,7 +1721,7 @@
         </w:tc>
         <w:tc>
           <w:tcPr>
-            <w:tcW w:w="1276" w:type="dxa"/>
+            <w:tcW w:w="1230" w:type="dxa"/>
           </w:tcPr>
           <w:p>
             <w:pPr>
@@ -1621,7 +1751,7 @@
         </w:tc>
         <w:tc>
           <w:tcPr>
-            <w:tcW w:w="851" w:type="dxa"/>
+            <w:tcW w:w="820" w:type="dxa"/>
           </w:tcPr>
           <w:p>
             <w:pPr>
@@ -1642,7 +1772,7 @@
         </w:tc>
         <w:tc>
           <w:tcPr>
-            <w:tcW w:w="1150" w:type="dxa"/>
+            <w:tcW w:w="1108" w:type="dxa"/>
           </w:tcPr>
           <w:p>
             <w:pPr>
@@ -1663,7 +1793,7 @@
         </w:tc>
         <w:tc>
           <w:tcPr>
-            <w:tcW w:w="1820" w:type="dxa"/>
+            <w:tcW w:w="1754" w:type="dxa"/>
           </w:tcPr>
           <w:p>
             <w:pPr>
@@ -1684,9 +1814,12 @@
         </w:tc>
       </w:tr>
       <w:tr>
-        <w:tc>
-          <w:tcPr>
-            <w:tcW w:w="1418" w:type="dxa"/>
+        <w:trPr>
+          <w:trHeight w:val="975"/>
+        </w:trPr>
+        <w:tc>
+          <w:tcPr>
+            <w:tcW w:w="1367" w:type="dxa"/>
           </w:tcPr>
           <w:p>
             <w:pPr>
@@ -1751,7 +1884,7 @@
         </w:tc>
         <w:tc>
           <w:tcPr>
-            <w:tcW w:w="2126" w:type="dxa"/>
+            <w:tcW w:w="2049" w:type="dxa"/>
           </w:tcPr>
           <w:p>
             <w:pPr>
@@ -1851,7 +1984,7 @@
         </w:tc>
         <w:tc>
           <w:tcPr>
-            <w:tcW w:w="1276" w:type="dxa"/>
+            <w:tcW w:w="1230" w:type="dxa"/>
           </w:tcPr>
           <w:p>
             <w:pPr>
@@ -1874,7 +2007,7 @@
         </w:tc>
         <w:tc>
           <w:tcPr>
-            <w:tcW w:w="851" w:type="dxa"/>
+            <w:tcW w:w="820" w:type="dxa"/>
           </w:tcPr>
           <w:p>
             <w:pPr>
@@ -1895,7 +2028,7 @@
         </w:tc>
         <w:tc>
           <w:tcPr>
-            <w:tcW w:w="1150" w:type="dxa"/>
+            <w:tcW w:w="1108" w:type="dxa"/>
           </w:tcPr>
           <w:p>
             <w:pPr>
@@ -1916,7 +2049,7 @@
         </w:tc>
         <w:tc>
           <w:tcPr>
-            <w:tcW w:w="1820" w:type="dxa"/>
+            <w:tcW w:w="1754" w:type="dxa"/>
           </w:tcPr>
           <w:p>
             <w:pPr>
@@ -1944,9 +2077,12 @@
         </w:tc>
       </w:tr>
       <w:tr>
-        <w:tc>
-          <w:tcPr>
-            <w:tcW w:w="1418" w:type="dxa"/>
+        <w:trPr>
+          <w:trHeight w:val="492"/>
+        </w:trPr>
+        <w:tc>
+          <w:tcPr>
+            <w:tcW w:w="1367" w:type="dxa"/>
           </w:tcPr>
           <w:p>
             <w:pPr>
@@ -1967,7 +2103,7 @@
         </w:tc>
         <w:tc>
           <w:tcPr>
-            <w:tcW w:w="2126" w:type="dxa"/>
+            <w:tcW w:w="2049" w:type="dxa"/>
           </w:tcPr>
           <w:p>
             <w:pPr>
@@ -2018,7 +2154,7 @@
         </w:tc>
         <w:tc>
           <w:tcPr>
-            <w:tcW w:w="1276" w:type="dxa"/>
+            <w:tcW w:w="1230" w:type="dxa"/>
           </w:tcPr>
           <w:p>
             <w:pPr>
@@ -2046,7 +2182,7 @@
         </w:tc>
         <w:tc>
           <w:tcPr>
-            <w:tcW w:w="851" w:type="dxa"/>
+            <w:tcW w:w="820" w:type="dxa"/>
           </w:tcPr>
           <w:p>
             <w:pPr>
@@ -2067,7 +2203,7 @@
         </w:tc>
         <w:tc>
           <w:tcPr>
-            <w:tcW w:w="1150" w:type="dxa"/>
+            <w:tcW w:w="1108" w:type="dxa"/>
           </w:tcPr>
           <w:p>
             <w:pPr>
@@ -2088,7 +2224,7 @@
         </w:tc>
         <w:tc>
           <w:tcPr>
-            <w:tcW w:w="1820" w:type="dxa"/>
+            <w:tcW w:w="1754" w:type="dxa"/>
           </w:tcPr>
           <w:p>
             <w:pPr>
@@ -2193,12 +2329,12 @@
         <w:tblLook w:val="04A0" w:firstRow="1" w:lastRow="0" w:firstColumn="1" w:lastColumn="0" w:noHBand="0" w:noVBand="1"/>
       </w:tblPr>
       <w:tblGrid>
-        <w:gridCol w:w="1187"/>
-        <w:gridCol w:w="2296"/>
-        <w:gridCol w:w="1076"/>
-        <w:gridCol w:w="1269"/>
-        <w:gridCol w:w="1350"/>
-        <w:gridCol w:w="1316"/>
+        <w:gridCol w:w="1415"/>
+        <w:gridCol w:w="2226"/>
+        <w:gridCol w:w="1416"/>
+        <w:gridCol w:w="1416"/>
+        <w:gridCol w:w="1416"/>
+        <w:gridCol w:w="1416"/>
       </w:tblGrid>
       <w:tr>
         <w:tc>
@@ -2218,7 +2354,6 @@
                 <w:b/>
                 <w:bCs/>
               </w:rPr>
-              <w:lastRenderedPageBreak/>
               <w:t>Atributo</w:t>
             </w:r>
           </w:p>
@@ -2692,6 +2827,15 @@
         </w:tc>
       </w:tr>
     </w:tbl>
+    <w:p>
+      <w:pPr>
+        <w:jc w:val="center"/>
+        <w:rPr>
+          <w:b/>
+          <w:bCs/>
+        </w:rPr>
+      </w:pPr>
+    </w:p>
     <w:p>
       <w:pPr>
         <w:jc w:val="center"/>
@@ -2715,12 +2859,12 @@
         <w:tblLook w:val="04A0" w:firstRow="1" w:lastRow="0" w:firstColumn="1" w:lastColumn="0" w:noHBand="0" w:noVBand="1"/>
       </w:tblPr>
       <w:tblGrid>
-        <w:gridCol w:w="1289"/>
-        <w:gridCol w:w="1744"/>
-        <w:gridCol w:w="1226"/>
-        <w:gridCol w:w="1334"/>
-        <w:gridCol w:w="1379"/>
-        <w:gridCol w:w="1522"/>
+        <w:gridCol w:w="1415"/>
+        <w:gridCol w:w="1621"/>
+        <w:gridCol w:w="1416"/>
+        <w:gridCol w:w="1416"/>
+        <w:gridCol w:w="1416"/>
+        <w:gridCol w:w="1535"/>
       </w:tblGrid>
       <w:tr>
         <w:tc>
@@ -3000,6 +3144,7 @@
                 <w:szCs w:val="22"/>
               </w:rPr>
             </w:pPr>
+            <w:proofErr w:type="gramStart"/>
             <w:r>
               <w:rPr>
                 <w:sz w:val="22"/>
@@ -3007,6 +3152,7 @@
               </w:rPr>
               <w:t>Chave Primaria</w:t>
             </w:r>
+            <w:proofErr w:type="gramEnd"/>
           </w:p>
         </w:tc>
       </w:tr>
@@ -3405,12 +3551,12 @@
         <w:tblLook w:val="04A0" w:firstRow="1" w:lastRow="0" w:firstColumn="1" w:lastColumn="0" w:noHBand="0" w:noVBand="1"/>
       </w:tblPr>
       <w:tblGrid>
-        <w:gridCol w:w="1194"/>
-        <w:gridCol w:w="2316"/>
-        <w:gridCol w:w="1032"/>
-        <w:gridCol w:w="1224"/>
-        <w:gridCol w:w="1460"/>
-        <w:gridCol w:w="1268"/>
+        <w:gridCol w:w="1415"/>
+        <w:gridCol w:w="2162"/>
+        <w:gridCol w:w="1416"/>
+        <w:gridCol w:w="1416"/>
+        <w:gridCol w:w="1416"/>
+        <w:gridCol w:w="1416"/>
       </w:tblGrid>
       <w:tr>
         <w:tc>
@@ -4328,6 +4474,7 @@
                 <w:szCs w:val="22"/>
               </w:rPr>
             </w:pPr>
+            <w:proofErr w:type="gramStart"/>
             <w:r>
               <w:rPr>
                 <w:sz w:val="22"/>
@@ -4335,6 +4482,7 @@
               </w:rPr>
               <w:t>Chave Primaria</w:t>
             </w:r>
+            <w:proofErr w:type="gramEnd"/>
           </w:p>
         </w:tc>
       </w:tr>
@@ -4450,12 +4598,12 @@
         <w:tblLook w:val="04A0" w:firstRow="1" w:lastRow="0" w:firstColumn="1" w:lastColumn="0" w:noHBand="0" w:noVBand="1"/>
       </w:tblPr>
       <w:tblGrid>
-        <w:gridCol w:w="1226"/>
-        <w:gridCol w:w="3284"/>
-        <w:gridCol w:w="949"/>
-        <w:gridCol w:w="1214"/>
-        <w:gridCol w:w="1325"/>
-        <w:gridCol w:w="1522"/>
+        <w:gridCol w:w="1165"/>
+        <w:gridCol w:w="3130"/>
+        <w:gridCol w:w="917"/>
+        <w:gridCol w:w="1148"/>
+        <w:gridCol w:w="1190"/>
+        <w:gridCol w:w="1543"/>
       </w:tblGrid>
       <w:tr>
         <w:trPr>
@@ -5200,11 +5348,57 @@
           <w:bCs/>
         </w:rPr>
       </w:pPr>
+    </w:p>
+    <w:p>
+      <w:pPr>
+        <w:jc w:val="center"/>
+        <w:rPr>
+          <w:b/>
+          <w:bCs/>
+        </w:rPr>
+      </w:pPr>
+    </w:p>
+    <w:p>
+      <w:pPr>
+        <w:jc w:val="center"/>
+        <w:rPr>
+          <w:b/>
+          <w:bCs/>
+        </w:rPr>
+      </w:pPr>
+    </w:p>
+    <w:p>
+      <w:pPr>
+        <w:jc w:val="center"/>
+        <w:rPr>
+          <w:b/>
+          <w:bCs/>
+        </w:rPr>
+      </w:pPr>
+    </w:p>
+    <w:p>
+      <w:pPr>
+        <w:jc w:val="center"/>
+        <w:rPr>
+          <w:b/>
+          <w:bCs/>
+        </w:rPr>
+      </w:pPr>
+    </w:p>
+    <w:p>
+      <w:pPr>
+        <w:jc w:val="center"/>
+        <w:rPr>
+          <w:b/>
+          <w:bCs/>
+        </w:rPr>
+      </w:pPr>
       <w:r>
         <w:rPr>
           <w:b/>
           <w:bCs/>
         </w:rPr>
+        <w:lastRenderedPageBreak/>
         <w:t>Tabela Itens do Contrato</w:t>
       </w:r>
     </w:p>
@@ -5215,17 +5409,17 @@
         <w:tblLook w:val="04A0" w:firstRow="1" w:lastRow="0" w:firstColumn="1" w:lastColumn="0" w:noHBand="0" w:noVBand="1"/>
       </w:tblPr>
       <w:tblGrid>
-        <w:gridCol w:w="1328"/>
-        <w:gridCol w:w="1811"/>
-        <w:gridCol w:w="1253"/>
-        <w:gridCol w:w="1345"/>
-        <w:gridCol w:w="1384"/>
-        <w:gridCol w:w="1521"/>
+        <w:gridCol w:w="1348"/>
+        <w:gridCol w:w="1721"/>
+        <w:gridCol w:w="1305"/>
+        <w:gridCol w:w="1356"/>
+        <w:gridCol w:w="1368"/>
+        <w:gridCol w:w="1544"/>
       </w:tblGrid>
       <w:tr>
         <w:tc>
           <w:tcPr>
-            <w:tcW w:w="1408" w:type="dxa"/>
+            <w:tcW w:w="1348" w:type="dxa"/>
           </w:tcPr>
           <w:p>
             <w:pPr>
@@ -5246,7 +5440,7 @@
         </w:tc>
         <w:tc>
           <w:tcPr>
-            <w:tcW w:w="1409" w:type="dxa"/>
+            <w:tcW w:w="1721" w:type="dxa"/>
           </w:tcPr>
           <w:p>
             <w:pPr>
@@ -5267,7 +5461,7 @@
         </w:tc>
         <w:tc>
           <w:tcPr>
-            <w:tcW w:w="1401" w:type="dxa"/>
+            <w:tcW w:w="1305" w:type="dxa"/>
           </w:tcPr>
           <w:p>
             <w:pPr>
@@ -5288,7 +5482,7 @@
         </w:tc>
         <w:tc>
           <w:tcPr>
-            <w:tcW w:w="1408" w:type="dxa"/>
+            <w:tcW w:w="1356" w:type="dxa"/>
           </w:tcPr>
           <w:p>
             <w:pPr>
@@ -5309,7 +5503,7 @@
         </w:tc>
         <w:tc>
           <w:tcPr>
-            <w:tcW w:w="1413" w:type="dxa"/>
+            <w:tcW w:w="1368" w:type="dxa"/>
           </w:tcPr>
           <w:p>
             <w:pPr>
@@ -5330,7 +5524,7 @@
         </w:tc>
         <w:tc>
           <w:tcPr>
-            <w:tcW w:w="1603" w:type="dxa"/>
+            <w:tcW w:w="1544" w:type="dxa"/>
           </w:tcPr>
           <w:p>
             <w:pPr>
@@ -5349,7 +5543,7 @@
       <w:tr>
         <w:tc>
           <w:tcPr>
-            <w:tcW w:w="1408" w:type="dxa"/>
+            <w:tcW w:w="1348" w:type="dxa"/>
           </w:tcPr>
           <w:p>
             <w:pPr>
@@ -5370,7 +5564,7 @@
         </w:tc>
         <w:tc>
           <w:tcPr>
-            <w:tcW w:w="1409" w:type="dxa"/>
+            <w:tcW w:w="1721" w:type="dxa"/>
           </w:tcPr>
           <w:p>
             <w:pPr>
@@ -5421,7 +5615,7 @@
         </w:tc>
         <w:tc>
           <w:tcPr>
-            <w:tcW w:w="1401" w:type="dxa"/>
+            <w:tcW w:w="1305" w:type="dxa"/>
           </w:tcPr>
           <w:p>
             <w:pPr>
@@ -5444,7 +5638,7 @@
         </w:tc>
         <w:tc>
           <w:tcPr>
-            <w:tcW w:w="1408" w:type="dxa"/>
+            <w:tcW w:w="1356" w:type="dxa"/>
           </w:tcPr>
           <w:p>
             <w:pPr>
@@ -5465,7 +5659,7 @@
         </w:tc>
         <w:tc>
           <w:tcPr>
-            <w:tcW w:w="1413" w:type="dxa"/>
+            <w:tcW w:w="1368" w:type="dxa"/>
           </w:tcPr>
           <w:p>
             <w:pPr>
@@ -5486,16 +5680,17 @@
         </w:tc>
         <w:tc>
           <w:tcPr>
-            <w:tcW w:w="1603" w:type="dxa"/>
-          </w:tcPr>
-          <w:p>
-            <w:pPr>
-              <w:jc w:val="center"/>
-              <w:rPr>
-                <w:sz w:val="22"/>
-                <w:szCs w:val="22"/>
-              </w:rPr>
-            </w:pPr>
+            <w:tcW w:w="1544" w:type="dxa"/>
+          </w:tcPr>
+          <w:p>
+            <w:pPr>
+              <w:jc w:val="center"/>
+              <w:rPr>
+                <w:sz w:val="22"/>
+                <w:szCs w:val="22"/>
+              </w:rPr>
+            </w:pPr>
+            <w:proofErr w:type="gramStart"/>
             <w:r>
               <w:rPr>
                 <w:sz w:val="22"/>
@@ -5508,7 +5703,15 @@
                 <w:sz w:val="22"/>
                 <w:szCs w:val="22"/>
               </w:rPr>
-              <w:t xml:space="preserve">Primaria e chave </w:t>
+              <w:t>Primaria</w:t>
+            </w:r>
+            <w:proofErr w:type="gramEnd"/>
+            <w:r>
+              <w:rPr>
+                <w:sz w:val="22"/>
+                <w:szCs w:val="22"/>
+              </w:rPr>
+              <w:t xml:space="preserve"> e chave </w:t>
             </w:r>
             <w:r>
               <w:rPr>
@@ -5523,7 +5726,7 @@
       <w:tr>
         <w:tc>
           <w:tcPr>
-            <w:tcW w:w="1408" w:type="dxa"/>
+            <w:tcW w:w="1348" w:type="dxa"/>
           </w:tcPr>
           <w:p>
             <w:pPr>
@@ -5544,7 +5747,7 @@
         </w:tc>
         <w:tc>
           <w:tcPr>
-            <w:tcW w:w="1409" w:type="dxa"/>
+            <w:tcW w:w="1721" w:type="dxa"/>
           </w:tcPr>
           <w:p>
             <w:pPr>
@@ -5595,7 +5798,7 @@
         </w:tc>
         <w:tc>
           <w:tcPr>
-            <w:tcW w:w="1401" w:type="dxa"/>
+            <w:tcW w:w="1305" w:type="dxa"/>
           </w:tcPr>
           <w:p>
             <w:pPr>
@@ -5618,7 +5821,7 @@
         </w:tc>
         <w:tc>
           <w:tcPr>
-            <w:tcW w:w="1408" w:type="dxa"/>
+            <w:tcW w:w="1356" w:type="dxa"/>
           </w:tcPr>
           <w:p>
             <w:pPr>
@@ -5639,7 +5842,7 @@
         </w:tc>
         <w:tc>
           <w:tcPr>
-            <w:tcW w:w="1413" w:type="dxa"/>
+            <w:tcW w:w="1368" w:type="dxa"/>
           </w:tcPr>
           <w:p>
             <w:pPr>
@@ -5660,7 +5863,7 @@
         </w:tc>
         <w:tc>
           <w:tcPr>
-            <w:tcW w:w="1603" w:type="dxa"/>
+            <w:tcW w:w="1544" w:type="dxa"/>
           </w:tcPr>
           <w:p>
             <w:pPr>
@@ -5704,9 +5907,104 @@
         </w:rPr>
       </w:pPr>
     </w:p>
+    <w:p>
+      <w:pPr>
+        <w:jc w:val="center"/>
+        <w:rPr>
+          <w:b/>
+          <w:bCs/>
+        </w:rPr>
+      </w:pPr>
+      <w:r>
+        <w:rPr>
+          <w:b/>
+          <w:bCs/>
+        </w:rPr>
+        <w:lastRenderedPageBreak/>
+        <w:drawing>
+          <wp:inline distT="0" distB="0" distL="0" distR="0" wp14:anchorId="537744EC" wp14:editId="5327F4D8">
+            <wp:extent cx="8892540" cy="4568190"/>
+            <wp:effectExtent l="0" t="0" r="3810" b="3810"/>
+            <wp:docPr id="3" name="Imagem 3"/>
+            <wp:cNvGraphicFramePr>
+              <a:graphicFrameLocks xmlns:a="http://schemas.openxmlformats.org/drawingml/2006/main" noChangeAspect="1"/>
+            </wp:cNvGraphicFramePr>
+            <a:graphic xmlns:a="http://schemas.openxmlformats.org/drawingml/2006/main">
+              <a:graphicData uri="http://schemas.openxmlformats.org/drawingml/2006/picture">
+                <pic:pic xmlns:pic="http://schemas.openxmlformats.org/drawingml/2006/picture">
+                  <pic:nvPicPr>
+                    <pic:cNvPr id="1" name=""/>
+                    <pic:cNvPicPr/>
+                  </pic:nvPicPr>
+                  <pic:blipFill>
+                    <a:blip r:embed="rId5"/>
+                    <a:stretch>
+                      <a:fillRect/>
+                    </a:stretch>
+                  </pic:blipFill>
+                  <pic:spPr>
+                    <a:xfrm>
+                      <a:off x="0" y="0"/>
+                      <a:ext cx="8892540" cy="4568190"/>
+                    </a:xfrm>
+                    <a:prstGeom prst="rect">
+                      <a:avLst/>
+                    </a:prstGeom>
+                  </pic:spPr>
+                </pic:pic>
+              </a:graphicData>
+            </a:graphic>
+          </wp:inline>
+        </w:drawing>
+      </w:r>
+      <w:bookmarkStart w:id="0" w:name="_GoBack"/>
+      <w:bookmarkEnd w:id="0"/>
+      <w:r>
+        <w:rPr>
+          <w:b/>
+          <w:bCs/>
+        </w:rPr>
+        <w:lastRenderedPageBreak/>
+        <w:drawing>
+          <wp:inline distT="0" distB="0" distL="0" distR="0" wp14:anchorId="3D118EDA" wp14:editId="789271ED">
+            <wp:extent cx="9002254" cy="4356100"/>
+            <wp:effectExtent l="0" t="0" r="8890" b="6350"/>
+            <wp:docPr id="1" name="Imagem 1"/>
+            <wp:cNvGraphicFramePr>
+              <a:graphicFrameLocks xmlns:a="http://schemas.openxmlformats.org/drawingml/2006/main" noChangeAspect="1"/>
+            </wp:cNvGraphicFramePr>
+            <a:graphic xmlns:a="http://schemas.openxmlformats.org/drawingml/2006/main">
+              <a:graphicData uri="http://schemas.openxmlformats.org/drawingml/2006/picture">
+                <pic:pic xmlns:pic="http://schemas.openxmlformats.org/drawingml/2006/picture">
+                  <pic:nvPicPr>
+                    <pic:cNvPr id="1" name=""/>
+                    <pic:cNvPicPr/>
+                  </pic:nvPicPr>
+                  <pic:blipFill>
+                    <a:blip r:embed="rId6"/>
+                    <a:stretch>
+                      <a:fillRect/>
+                    </a:stretch>
+                  </pic:blipFill>
+                  <pic:spPr>
+                    <a:xfrm>
+                      <a:off x="0" y="0"/>
+                      <a:ext cx="9054684" cy="4381470"/>
+                    </a:xfrm>
+                    <a:prstGeom prst="rect">
+                      <a:avLst/>
+                    </a:prstGeom>
+                  </pic:spPr>
+                </pic:pic>
+              </a:graphicData>
+            </a:graphic>
+          </wp:inline>
+        </w:drawing>
+      </w:r>
+    </w:p>
     <w:sectPr>
-      <w:pgSz w:w="11906" w:h="16838"/>
-      <w:pgMar w:top="1417" w:right="1701" w:bottom="1417" w:left="1701" w:header="708" w:footer="708" w:gutter="0"/>
+      <w:pgSz w:w="16838" w:h="11906" w:orient="landscape"/>
+      <w:pgMar w:top="1701" w:right="1417" w:bottom="1701" w:left="1417" w:header="708" w:footer="708" w:gutter="0"/>
       <w:cols w:space="708"/>
       <w:docGrid w:linePitch="360"/>
     </w:sectPr>
@@ -5715,7 +6013,7 @@
 </file>
 
 <file path=word/styles.xml><?xml version="1.0" encoding="utf-8"?>
-<w:styles xmlns:mc="http://schemas.openxmlformats.org/markup-compatibility/2006" xmlns:r="http://schemas.openxmlformats.org/officeDocument/2006/relationships" xmlns:w="http://schemas.openxmlformats.org/wordprocessingml/2006/main" xmlns:w14="http://schemas.microsoft.com/office/word/2010/wordml" xmlns:w15="http://schemas.microsoft.com/office/word/2012/wordml" xmlns:w16cex="http://schemas.microsoft.com/office/word/2018/wordml/cex" xmlns:w16cid="http://schemas.microsoft.com/office/word/2016/wordml/cid" xmlns:w16="http://schemas.microsoft.com/office/word/2018/wordml" xmlns:w16du="http://schemas.microsoft.com/office/word/2023/wordml/word16du" xmlns:w16sdtdh="http://schemas.microsoft.com/office/word/2020/wordml/sdtdatahash" xmlns:w16sdtfl="http://schemas.microsoft.com/office/word/2024/wordml/sdtformatlock" xmlns:w16se="http://schemas.microsoft.com/office/word/2015/wordml/symex" mc:Ignorable="w14 w15 w16se w16cid w16 w16cex w16sdtdh w16sdtfl w16du">
+<w:styles xmlns:mc="http://schemas.openxmlformats.org/markup-compatibility/2006" xmlns:r="http://schemas.openxmlformats.org/officeDocument/2006/relationships" xmlns:w="http://schemas.openxmlformats.org/wordprocessingml/2006/main" xmlns:w14="http://schemas.microsoft.com/office/word/2010/wordml" xmlns:w15="http://schemas.microsoft.com/office/word/2012/wordml" xmlns:w16cid="http://schemas.microsoft.com/office/word/2016/wordml/cid" xmlns:w16se="http://schemas.microsoft.com/office/word/2015/wordml/symex" mc:Ignorable="w14 w15 w16se w16cid">
   <w:docDefaults>
     <w:rPrDefault>
       <w:rPr>
@@ -5733,7 +6031,7 @@
       </w:pPr>
     </w:pPrDefault>
   </w:docDefaults>
-  <w:latentStyles w:defLockedState="0" w:defUIPriority="99" w:defSemiHidden="0" w:defUnhideWhenUsed="0" w:defQFormat="0" w:count="376">
+  <w:latentStyles w:defLockedState="0" w:defUIPriority="99" w:defSemiHidden="0" w:defUnhideWhenUsed="0" w:defQFormat="0" w:count="375">
     <w:lsdException w:name="Normal" w:uiPriority="0" w:qFormat="1"/>
     <w:lsdException w:name="heading 1" w:uiPriority="9" w:qFormat="1"/>
     <w:lsdException w:name="heading 2" w:semiHidden="1" w:uiPriority="9" w:unhideWhenUsed="1" w:qFormat="1"/>
@@ -6109,7 +6407,6 @@
     <w:lsdException w:name="Smart Hyperlink" w:semiHidden="1" w:unhideWhenUsed="1"/>
     <w:lsdException w:name="Hashtag" w:semiHidden="1" w:unhideWhenUsed="1"/>
     <w:lsdException w:name="Unresolved Mention" w:semiHidden="1" w:unhideWhenUsed="1"/>
-    <w:lsdException w:name="Smart Link" w:semiHidden="1" w:unhideWhenUsed="1"/>
   </w:latentStyles>
   <w:style w:type="paragraph" w:default="1" w:styleId="Normal">
     <w:name w:val="Normal"/>
@@ -6966,4 +7263,16 @@
     </a:ext>
   </a:extLst>
 </a:theme>
+</file>
+
+<file path=customXml/item1.xml><?xml version="1.0" encoding="utf-8"?>
+<b:Sources xmlns:b="http://schemas.openxmlformats.org/officeDocument/2006/bibliography" xmlns="http://schemas.openxmlformats.org/officeDocument/2006/bibliography" SelectedStyle="\APASixthEditionOfficeOnline.xsl" StyleName="APA" Version="6"/>
+</file>
+
+<file path=customXml/itemProps1.xml><?xml version="1.0" encoding="utf-8"?>
+<ds:datastoreItem xmlns:ds="http://schemas.openxmlformats.org/officeDocument/2006/customXml" ds:itemID="{8E4E192C-6B74-4C2C-8F89-940DFDBCB54F}">
+  <ds:schemaRefs>
+    <ds:schemaRef ds:uri="http://schemas.openxmlformats.org/officeDocument/2006/bibliography"/>
+  </ds:schemaRefs>
+</ds:datastoreItem>
 </file>
</xml_diff>